<commit_message>
updating with africacdc for testing
</commit_message>
<xml_diff>
--- a/Data/Methods/Contributors_Methods_Data_website.docx
+++ b/Data/Methods/Contributors_Methods_Data_website.docx
@@ -669,7 +669,58 @@
           <w:kern w:val="0"/>
           <w14:ligatures w14:val="none"/>
         </w:rPr>
-        <w:t xml:space="preserve">Pairwise great-circle (haversine) distances are computed directly from the health zone centroids. Outbreak counts (suspected/confirmed cases and deaths) are extracted from the </w:t>
+        <w:t xml:space="preserve">Pairwise great-circle (haversine) distances are computed directly from the health zone centroids. </w:t>
+      </w:r>
+      <w:r>
+        <w:rPr>
+          <w:rFonts w:ascii="Times New Roman" w:eastAsia="Times New Roman" w:hAnsi="Times New Roman" w:cs="Times New Roman"/>
+          <w:color w:val="000000"/>
+          <w:kern w:val="0"/>
+          <w14:ligatures w14:val="none"/>
+        </w:rPr>
+        <w:t xml:space="preserve">PCR testing capacity data was made available by </w:t>
+      </w:r>
+      <w:hyperlink r:id="rId12" w:history="1">
+        <w:proofErr w:type="spellStart"/>
+        <w:r>
+          <w:rPr>
+            <w:rStyle w:val="Hyperlink"/>
+            <w:rFonts w:ascii="Times New Roman" w:eastAsia="Times New Roman" w:hAnsi="Times New Roman" w:cs="Times New Roman"/>
+            <w:kern w:val="0"/>
+            <w14:ligatures w14:val="none"/>
+          </w:rPr>
+          <w:t>AfricaCDC</w:t>
+        </w:r>
+        <w:proofErr w:type="spellEnd"/>
+      </w:hyperlink>
+      <w:r>
+        <w:rPr>
+          <w:rFonts w:ascii="Times New Roman" w:eastAsia="Times New Roman" w:hAnsi="Times New Roman" w:cs="Times New Roman"/>
+          <w:color w:val="000000"/>
+          <w:kern w:val="0"/>
+          <w14:ligatures w14:val="none"/>
+        </w:rPr>
+        <w:t xml:space="preserve">. </w:t>
+      </w:r>
+      <w:proofErr w:type="spellStart"/>
+      <w:r>
+        <w:rPr>
+          <w:rFonts w:ascii="Times New Roman" w:eastAsia="Times New Roman" w:hAnsi="Times New Roman" w:cs="Times New Roman"/>
+          <w:color w:val="000000"/>
+          <w:kern w:val="0"/>
+          <w14:ligatures w14:val="none"/>
+        </w:rPr>
+        <w:t>Outbreak</w:t>
+      </w:r>
+      <w:proofErr w:type="spellEnd"/>
+      <w:r>
+        <w:rPr>
+          <w:rFonts w:ascii="Times New Roman" w:eastAsia="Times New Roman" w:hAnsi="Times New Roman" w:cs="Times New Roman"/>
+          <w:color w:val="000000"/>
+          <w:kern w:val="0"/>
+          <w14:ligatures w14:val="none"/>
+        </w:rPr>
+        <w:t xml:space="preserve"> counts (suspected/confirmed cases and deaths) are extracted from the </w:t>
       </w:r>
       <w:r>
         <w:rPr>
@@ -680,7 +731,7 @@
         </w:rPr>
         <w:t xml:space="preserve">latest </w:t>
       </w:r>
-      <w:hyperlink r:id="rId12" w:history="1">
+      <w:hyperlink r:id="rId13" w:history="1">
         <w:r>
           <w:rPr>
             <w:rStyle w:val="Hyperlink"/>
@@ -717,6 +768,15 @@
           <w14:ligatures w14:val="none"/>
         </w:rPr>
         <w:t>.</w:t>
+      </w:r>
+      <w:r>
+        <w:rPr>
+          <w:rFonts w:ascii="Times New Roman" w:eastAsia="Times New Roman" w:hAnsi="Times New Roman" w:cs="Times New Roman"/>
+          <w:color w:val="000000"/>
+          <w:kern w:val="0"/>
+          <w14:ligatures w14:val="none"/>
+        </w:rPr>
+        <w:t xml:space="preserve"> </w:t>
       </w:r>
     </w:p>
     <w:p>
@@ -2953,6 +3013,7 @@
   <w:style w:type="character" w:default="1" w:styleId="DefaultParagraphFont">
     <w:name w:val="Default Paragraph Font"/>
     <w:uiPriority w:val="1"/>
+    <w:semiHidden/>
     <w:unhideWhenUsed/>
   </w:style>
   <w:style w:type="table" w:default="1" w:styleId="TableNormal">

</xml_diff>